<commit_message>
TC-41: correcting an incorrectly formatted test
</commit_message>
<xml_diff>
--- a/java-thesis-checker/src/test/resources/incorrect_list_formatting.docx
+++ b/java-thesis-checker/src/test/resources/incorrect_list_formatting.docx
@@ -119,7 +119,13 @@
         <w:rPr>
           <w:lang w:val="uk-UA"/>
         </w:rPr>
-        <w:t>арабські числа</w:t>
+        <w:t>римські</w:t>
+      </w:r>
+      <w:r>
+        <w:rPr>
+          <w:lang w:val="uk-UA"/>
+        </w:rPr>
+        <w:t xml:space="preserve"> числа</w:t>
       </w:r>
       <w:r>
         <w:t>.</w:t>

</xml_diff>

<commit_message>
TC-142: added warning when find list without style
</commit_message>
<xml_diff>
--- a/java-thesis-checker/src/test/resources/incorrect_list_formatting.docx
+++ b/java-thesis-checker/src/test/resources/incorrect_list_formatting.docx
@@ -131,6 +131,56 @@
         <w:t>.</w:t>
       </w:r>
     </w:p>
+    <w:p>
+      <w:pPr>
+        <w:spacing w:after="80"/>
+      </w:pPr>
+    </w:p>
+    <w:p>
+      <w:pPr>
+        <w:spacing w:after="80"/>
+        <w:rPr>
+          <w:lang w:val="uk-UA"/>
+        </w:rPr>
+      </w:pPr>
+      <w:r>
+        <w:t xml:space="preserve">1) </w:t>
+      </w:r>
+      <w:r>
+        <w:rPr>
+          <w:lang w:val="uk-UA"/>
+        </w:rPr>
+        <w:t>Ручне форматування списку, перше</w:t>
+      </w:r>
+    </w:p>
+    <w:p>
+      <w:pPr>
+        <w:spacing w:after="80"/>
+        <w:rPr>
+          <w:lang w:val="uk-UA"/>
+        </w:rPr>
+      </w:pPr>
+      <w:r>
+        <w:rPr>
+          <w:lang w:val="uk-UA"/>
+        </w:rPr>
+        <w:t>2. Ручне форматування списку, друге</w:t>
+      </w:r>
+    </w:p>
+    <w:p>
+      <w:pPr>
+        <w:spacing w:after="80"/>
+        <w:rPr>
+          <w:lang w:val="uk-UA"/>
+        </w:rPr>
+      </w:pPr>
+      <w:r>
+        <w:rPr>
+          <w:lang w:val="uk-UA"/>
+        </w:rPr>
+        <w:t>а) Ручне, форматування списку, третє</w:t>
+      </w:r>
+    </w:p>
     <w:sectPr>
       <w:pgSz w:w="11906" w:h="16838"/>
       <w:pgMar w:top="1440" w:right="1440" w:bottom="1440" w:left="1440" w:header="708" w:footer="708" w:gutter="0"/>
@@ -144,6 +194,184 @@
 <file path=word/numbering.xml><?xml version="1.0" encoding="utf-8"?>
 <w:numbering xmlns:wpc="http://schemas.microsoft.com/office/word/2010/wordprocessingCanvas" xmlns:cx="http://schemas.microsoft.com/office/drawing/2014/chartex" xmlns:cx1="http://schemas.microsoft.com/office/drawing/2015/9/8/chartex" xmlns:cx2="http://schemas.microsoft.com/office/drawing/2015/10/21/chartex" xmlns:cx3="http://schemas.microsoft.com/office/drawing/2016/5/9/chartex" xmlns:cx4="http://schemas.microsoft.com/office/drawing/2016/5/10/chartex" xmlns:cx5="http://schemas.microsoft.com/office/drawing/2016/5/11/chartex" xmlns:cx6="http://schemas.microsoft.com/office/drawing/2016/5/12/chartex" xmlns:cx7="http://schemas.microsoft.com/office/drawing/2016/5/13/chartex" xmlns:cx8="http://schemas.microsoft.com/office/drawing/2016/5/14/chartex" xmlns:mc="http://schemas.openxmlformats.org/markup-compatibility/2006" xmlns:aink="http://schemas.microsoft.com/office/drawing/2016/ink" xmlns:am3d="http://schemas.microsoft.com/office/drawing/2017/model3d" xmlns:o="urn:schemas-microsoft-com:office:office" xmlns:oel="http://schemas.microsoft.com/office/2019/extlst" xmlns:r="http://schemas.openxmlformats.org/officeDocument/2006/relationships" xmlns:m="http://schemas.openxmlformats.org/officeDocument/2006/math" xmlns:v="urn:schemas-microsoft-com:vml" xmlns:wp14="http://schemas.microsoft.com/office/word/2010/wordprocessingDrawing" xmlns:wp="http://schemas.openxmlformats.org/drawingml/2006/wordprocessingDrawing" xmlns:w10="urn:schemas-microsoft-com:office:word" xmlns:w="http://schemas.openxmlformats.org/wordprocessingml/2006/main" xmlns:w14="http://schemas.microsoft.com/office/word/2010/wordml" xmlns:w15="http://schemas.microsoft.com/office/word/2012/wordml" xmlns:w16cex="http://schemas.microsoft.com/office/word/2018/wordml/cex" xmlns:w16cid="http://schemas.microsoft.com/office/word/2016/wordml/cid" xmlns:w16="http://schemas.microsoft.com/office/word/2018/wordml" xmlns:w16du="http://schemas.microsoft.com/office/word/2023/wordml/word16du" xmlns:w16sdtdh="http://schemas.microsoft.com/office/word/2020/wordml/sdtdatahash" xmlns:w16sdtfl="http://schemas.microsoft.com/office/word/2024/wordml/sdtformatlock" xmlns:w16se="http://schemas.microsoft.com/office/word/2015/wordml/symex" xmlns:wpg="http://schemas.microsoft.com/office/word/2010/wordprocessingGroup" xmlns:wpi="http://schemas.microsoft.com/office/word/2010/wordprocessingInk" xmlns:wne="http://schemas.microsoft.com/office/word/2006/wordml" xmlns:wps="http://schemas.microsoft.com/office/word/2010/wordprocessingShape" mc:Ignorable="w14 w15 w16se w16cid w16 w16cex w16sdtdh w16sdtfl w16du wp14">
   <w:abstractNum w:abstractNumId="0" w15:restartNumberingAfterBreak="0">
+    <w:nsid w:val="025D6061"/>
+    <w:multiLevelType w:val="hybridMultilevel"/>
+    <w:tmpl w:val="BEAC4D10"/>
+    <w:lvl w:ilvl="0" w:tplc="08090011">
+      <w:start w:val="1"/>
+      <w:numFmt w:val="decimal"/>
+      <w:lvlText w:val="%1)"/>
+      <w:lvlJc w:val="left"/>
+      <w:pPr>
+        <w:ind w:left="720" w:hanging="360"/>
+      </w:pPr>
+      <w:rPr>
+        <w:rFonts w:hint="default"/>
+      </w:rPr>
+    </w:lvl>
+    <w:lvl w:ilvl="1" w:tplc="08090019" w:tentative="1">
+      <w:start w:val="1"/>
+      <w:numFmt w:val="lowerLetter"/>
+      <w:lvlText w:val="%2."/>
+      <w:lvlJc w:val="left"/>
+      <w:pPr>
+        <w:ind w:left="1440" w:hanging="360"/>
+      </w:pPr>
+    </w:lvl>
+    <w:lvl w:ilvl="2" w:tplc="0809001B" w:tentative="1">
+      <w:start w:val="1"/>
+      <w:numFmt w:val="lowerRoman"/>
+      <w:lvlText w:val="%3."/>
+      <w:lvlJc w:val="right"/>
+      <w:pPr>
+        <w:ind w:left="2160" w:hanging="180"/>
+      </w:pPr>
+    </w:lvl>
+    <w:lvl w:ilvl="3" w:tplc="0809000F" w:tentative="1">
+      <w:start w:val="1"/>
+      <w:numFmt w:val="decimal"/>
+      <w:lvlText w:val="%4."/>
+      <w:lvlJc w:val="left"/>
+      <w:pPr>
+        <w:ind w:left="2880" w:hanging="360"/>
+      </w:pPr>
+    </w:lvl>
+    <w:lvl w:ilvl="4" w:tplc="08090019" w:tentative="1">
+      <w:start w:val="1"/>
+      <w:numFmt w:val="lowerLetter"/>
+      <w:lvlText w:val="%5."/>
+      <w:lvlJc w:val="left"/>
+      <w:pPr>
+        <w:ind w:left="3600" w:hanging="360"/>
+      </w:pPr>
+    </w:lvl>
+    <w:lvl w:ilvl="5" w:tplc="0809001B" w:tentative="1">
+      <w:start w:val="1"/>
+      <w:numFmt w:val="lowerRoman"/>
+      <w:lvlText w:val="%6."/>
+      <w:lvlJc w:val="right"/>
+      <w:pPr>
+        <w:ind w:left="4320" w:hanging="180"/>
+      </w:pPr>
+    </w:lvl>
+    <w:lvl w:ilvl="6" w:tplc="0809000F" w:tentative="1">
+      <w:start w:val="1"/>
+      <w:numFmt w:val="decimal"/>
+      <w:lvlText w:val="%7."/>
+      <w:lvlJc w:val="left"/>
+      <w:pPr>
+        <w:ind w:left="5040" w:hanging="360"/>
+      </w:pPr>
+    </w:lvl>
+    <w:lvl w:ilvl="7" w:tplc="08090019" w:tentative="1">
+      <w:start w:val="1"/>
+      <w:numFmt w:val="lowerLetter"/>
+      <w:lvlText w:val="%8."/>
+      <w:lvlJc w:val="left"/>
+      <w:pPr>
+        <w:ind w:left="5760" w:hanging="360"/>
+      </w:pPr>
+    </w:lvl>
+    <w:lvl w:ilvl="8" w:tplc="0809001B" w:tentative="1">
+      <w:start w:val="1"/>
+      <w:numFmt w:val="lowerRoman"/>
+      <w:lvlText w:val="%9."/>
+      <w:lvlJc w:val="right"/>
+      <w:pPr>
+        <w:ind w:left="6480" w:hanging="180"/>
+      </w:pPr>
+    </w:lvl>
+  </w:abstractNum>
+  <w:abstractNum w:abstractNumId="1" w15:restartNumberingAfterBreak="0">
+    <w:nsid w:val="0C5F3FF0"/>
+    <w:multiLevelType w:val="hybridMultilevel"/>
+    <w:tmpl w:val="40D6B1EE"/>
+    <w:lvl w:ilvl="0" w:tplc="08090011">
+      <w:start w:val="1"/>
+      <w:numFmt w:val="decimal"/>
+      <w:lvlText w:val="%1)"/>
+      <w:lvlJc w:val="left"/>
+      <w:pPr>
+        <w:ind w:left="720" w:hanging="360"/>
+      </w:pPr>
+      <w:rPr>
+        <w:rFonts w:hint="default"/>
+      </w:rPr>
+    </w:lvl>
+    <w:lvl w:ilvl="1" w:tplc="08090019" w:tentative="1">
+      <w:start w:val="1"/>
+      <w:numFmt w:val="lowerLetter"/>
+      <w:lvlText w:val="%2."/>
+      <w:lvlJc w:val="left"/>
+      <w:pPr>
+        <w:ind w:left="1440" w:hanging="360"/>
+      </w:pPr>
+    </w:lvl>
+    <w:lvl w:ilvl="2" w:tplc="0809001B" w:tentative="1">
+      <w:start w:val="1"/>
+      <w:numFmt w:val="lowerRoman"/>
+      <w:lvlText w:val="%3."/>
+      <w:lvlJc w:val="right"/>
+      <w:pPr>
+        <w:ind w:left="2160" w:hanging="180"/>
+      </w:pPr>
+    </w:lvl>
+    <w:lvl w:ilvl="3" w:tplc="0809000F" w:tentative="1">
+      <w:start w:val="1"/>
+      <w:numFmt w:val="decimal"/>
+      <w:lvlText w:val="%4."/>
+      <w:lvlJc w:val="left"/>
+      <w:pPr>
+        <w:ind w:left="2880" w:hanging="360"/>
+      </w:pPr>
+    </w:lvl>
+    <w:lvl w:ilvl="4" w:tplc="08090019" w:tentative="1">
+      <w:start w:val="1"/>
+      <w:numFmt w:val="lowerLetter"/>
+      <w:lvlText w:val="%5."/>
+      <w:lvlJc w:val="left"/>
+      <w:pPr>
+        <w:ind w:left="3600" w:hanging="360"/>
+      </w:pPr>
+    </w:lvl>
+    <w:lvl w:ilvl="5" w:tplc="0809001B" w:tentative="1">
+      <w:start w:val="1"/>
+      <w:numFmt w:val="lowerRoman"/>
+      <w:lvlText w:val="%6."/>
+      <w:lvlJc w:val="right"/>
+      <w:pPr>
+        <w:ind w:left="4320" w:hanging="180"/>
+      </w:pPr>
+    </w:lvl>
+    <w:lvl w:ilvl="6" w:tplc="0809000F" w:tentative="1">
+      <w:start w:val="1"/>
+      <w:numFmt w:val="decimal"/>
+      <w:lvlText w:val="%7."/>
+      <w:lvlJc w:val="left"/>
+      <w:pPr>
+        <w:ind w:left="5040" w:hanging="360"/>
+      </w:pPr>
+    </w:lvl>
+    <w:lvl w:ilvl="7" w:tplc="08090019" w:tentative="1">
+      <w:start w:val="1"/>
+      <w:numFmt w:val="lowerLetter"/>
+      <w:lvlText w:val="%8."/>
+      <w:lvlJc w:val="left"/>
+      <w:pPr>
+        <w:ind w:left="5760" w:hanging="360"/>
+      </w:pPr>
+    </w:lvl>
+    <w:lvl w:ilvl="8" w:tplc="0809001B" w:tentative="1">
+      <w:start w:val="1"/>
+      <w:numFmt w:val="lowerRoman"/>
+      <w:lvlText w:val="%9."/>
+      <w:lvlJc w:val="right"/>
+      <w:pPr>
+        <w:ind w:left="6480" w:hanging="180"/>
+      </w:pPr>
+    </w:lvl>
+  </w:abstractNum>
+  <w:abstractNum w:abstractNumId="2" w15:restartNumberingAfterBreak="0">
     <w:nsid w:val="25C53EB1"/>
     <w:multiLevelType w:val="hybridMultilevel"/>
     <w:tmpl w:val="CC321E76"/>
@@ -229,7 +457,7 @@
       </w:pPr>
     </w:lvl>
   </w:abstractNum>
-  <w:abstractNum w:abstractNumId="1" w15:restartNumberingAfterBreak="0">
+  <w:abstractNum w:abstractNumId="3" w15:restartNumberingAfterBreak="0">
     <w:nsid w:val="362E46BD"/>
     <w:multiLevelType w:val="hybridMultilevel"/>
     <w:tmpl w:val="E4FAEC1A"/>
@@ -283,7 +511,7 @@
       <w:lvlJc w:val="left"/>
     </w:lvl>
   </w:abstractNum>
-  <w:abstractNum w:abstractNumId="2" w15:restartNumberingAfterBreak="0">
+  <w:abstractNum w:abstractNumId="4" w15:restartNumberingAfterBreak="0">
     <w:nsid w:val="377A7A3E"/>
     <w:multiLevelType w:val="hybridMultilevel"/>
     <w:tmpl w:val="E37813AE"/>
@@ -396,7 +624,7 @@
       </w:rPr>
     </w:lvl>
   </w:abstractNum>
-  <w:abstractNum w:abstractNumId="3" w15:restartNumberingAfterBreak="0">
+  <w:abstractNum w:abstractNumId="5" w15:restartNumberingAfterBreak="0">
     <w:nsid w:val="5D705DF0"/>
     <w:multiLevelType w:val="hybridMultilevel"/>
     <w:tmpl w:val="362A7BC0"/>
@@ -458,7 +686,7 @@
       <w:lvlJc w:val="left"/>
     </w:lvl>
   </w:abstractNum>
-  <w:abstractNum w:abstractNumId="4" w15:restartNumberingAfterBreak="0">
+  <w:abstractNum w:abstractNumId="6" w15:restartNumberingAfterBreak="0">
     <w:nsid w:val="5FB5656A"/>
     <w:multiLevelType w:val="hybridMultilevel"/>
     <w:tmpl w:val="DC486B94"/>
@@ -512,7 +740,7 @@
       <w:lvlJc w:val="left"/>
     </w:lvl>
   </w:abstractNum>
-  <w:abstractNum w:abstractNumId="5" w15:restartNumberingAfterBreak="0">
+  <w:abstractNum w:abstractNumId="7" w15:restartNumberingAfterBreak="0">
     <w:nsid w:val="70C6202F"/>
     <w:multiLevelType w:val="hybridMultilevel"/>
     <w:tmpl w:val="B762D162"/>
@@ -567,37 +795,43 @@
     </w:lvl>
   </w:abstractNum>
   <w:num w:numId="1" w16cid:durableId="1419601051">
-    <w:abstractNumId w:val="0"/>
+    <w:abstractNumId w:val="2"/>
     <w:lvlOverride w:ilvl="0">
       <w:startOverride w:val="1"/>
     </w:lvlOverride>
   </w:num>
   <w:num w:numId="2" w16cid:durableId="925579691">
-    <w:abstractNumId w:val="1"/>
+    <w:abstractNumId w:val="3"/>
     <w:lvlOverride w:ilvl="0">
       <w:startOverride w:val="1"/>
     </w:lvlOverride>
   </w:num>
   <w:num w:numId="3" w16cid:durableId="188299818">
-    <w:abstractNumId w:val="3"/>
+    <w:abstractNumId w:val="5"/>
     <w:lvlOverride w:ilvl="0">
       <w:startOverride w:val="1"/>
     </w:lvlOverride>
   </w:num>
   <w:num w:numId="4" w16cid:durableId="984160672">
-    <w:abstractNumId w:val="5"/>
+    <w:abstractNumId w:val="7"/>
     <w:lvlOverride w:ilvl="0">
       <w:startOverride w:val="1"/>
     </w:lvlOverride>
   </w:num>
   <w:num w:numId="5" w16cid:durableId="2013215055">
-    <w:abstractNumId w:val="4"/>
+    <w:abstractNumId w:val="6"/>
     <w:lvlOverride w:ilvl="0">
       <w:startOverride w:val="1"/>
     </w:lvlOverride>
   </w:num>
   <w:num w:numId="6" w16cid:durableId="2037658484">
-    <w:abstractNumId w:val="2"/>
+    <w:abstractNumId w:val="4"/>
+  </w:num>
+  <w:num w:numId="7" w16cid:durableId="1162618692">
+    <w:abstractNumId w:val="1"/>
+  </w:num>
+  <w:num w:numId="8" w16cid:durableId="256134231">
+    <w:abstractNumId w:val="0"/>
   </w:num>
 </w:numbering>
 </file>

</xml_diff>

<commit_message>
TC-142: added warning when find list without style (#62)
</commit_message>
<xml_diff>
--- a/java-thesis-checker/src/test/resources/incorrect_list_formatting.docx
+++ b/java-thesis-checker/src/test/resources/incorrect_list_formatting.docx
@@ -131,6 +131,56 @@
         <w:t>.</w:t>
       </w:r>
     </w:p>
+    <w:p>
+      <w:pPr>
+        <w:spacing w:after="80"/>
+      </w:pPr>
+    </w:p>
+    <w:p>
+      <w:pPr>
+        <w:spacing w:after="80"/>
+        <w:rPr>
+          <w:lang w:val="uk-UA"/>
+        </w:rPr>
+      </w:pPr>
+      <w:r>
+        <w:t xml:space="preserve">1) </w:t>
+      </w:r>
+      <w:r>
+        <w:rPr>
+          <w:lang w:val="uk-UA"/>
+        </w:rPr>
+        <w:t>Ручне форматування списку, перше</w:t>
+      </w:r>
+    </w:p>
+    <w:p>
+      <w:pPr>
+        <w:spacing w:after="80"/>
+        <w:rPr>
+          <w:lang w:val="uk-UA"/>
+        </w:rPr>
+      </w:pPr>
+      <w:r>
+        <w:rPr>
+          <w:lang w:val="uk-UA"/>
+        </w:rPr>
+        <w:t>2. Ручне форматування списку, друге</w:t>
+      </w:r>
+    </w:p>
+    <w:p>
+      <w:pPr>
+        <w:spacing w:after="80"/>
+        <w:rPr>
+          <w:lang w:val="uk-UA"/>
+        </w:rPr>
+      </w:pPr>
+      <w:r>
+        <w:rPr>
+          <w:lang w:val="uk-UA"/>
+        </w:rPr>
+        <w:t>а) Ручне, форматування списку, третє</w:t>
+      </w:r>
+    </w:p>
     <w:sectPr>
       <w:pgSz w:w="11906" w:h="16838"/>
       <w:pgMar w:top="1440" w:right="1440" w:bottom="1440" w:left="1440" w:header="708" w:footer="708" w:gutter="0"/>
@@ -144,6 +194,184 @@
 <file path=word/numbering.xml><?xml version="1.0" encoding="utf-8"?>
 <w:numbering xmlns:wpc="http://schemas.microsoft.com/office/word/2010/wordprocessingCanvas" xmlns:cx="http://schemas.microsoft.com/office/drawing/2014/chartex" xmlns:cx1="http://schemas.microsoft.com/office/drawing/2015/9/8/chartex" xmlns:cx2="http://schemas.microsoft.com/office/drawing/2015/10/21/chartex" xmlns:cx3="http://schemas.microsoft.com/office/drawing/2016/5/9/chartex" xmlns:cx4="http://schemas.microsoft.com/office/drawing/2016/5/10/chartex" xmlns:cx5="http://schemas.microsoft.com/office/drawing/2016/5/11/chartex" xmlns:cx6="http://schemas.microsoft.com/office/drawing/2016/5/12/chartex" xmlns:cx7="http://schemas.microsoft.com/office/drawing/2016/5/13/chartex" xmlns:cx8="http://schemas.microsoft.com/office/drawing/2016/5/14/chartex" xmlns:mc="http://schemas.openxmlformats.org/markup-compatibility/2006" xmlns:aink="http://schemas.microsoft.com/office/drawing/2016/ink" xmlns:am3d="http://schemas.microsoft.com/office/drawing/2017/model3d" xmlns:o="urn:schemas-microsoft-com:office:office" xmlns:oel="http://schemas.microsoft.com/office/2019/extlst" xmlns:r="http://schemas.openxmlformats.org/officeDocument/2006/relationships" xmlns:m="http://schemas.openxmlformats.org/officeDocument/2006/math" xmlns:v="urn:schemas-microsoft-com:vml" xmlns:wp14="http://schemas.microsoft.com/office/word/2010/wordprocessingDrawing" xmlns:wp="http://schemas.openxmlformats.org/drawingml/2006/wordprocessingDrawing" xmlns:w10="urn:schemas-microsoft-com:office:word" xmlns:w="http://schemas.openxmlformats.org/wordprocessingml/2006/main" xmlns:w14="http://schemas.microsoft.com/office/word/2010/wordml" xmlns:w15="http://schemas.microsoft.com/office/word/2012/wordml" xmlns:w16cex="http://schemas.microsoft.com/office/word/2018/wordml/cex" xmlns:w16cid="http://schemas.microsoft.com/office/word/2016/wordml/cid" xmlns:w16="http://schemas.microsoft.com/office/word/2018/wordml" xmlns:w16du="http://schemas.microsoft.com/office/word/2023/wordml/word16du" xmlns:w16sdtdh="http://schemas.microsoft.com/office/word/2020/wordml/sdtdatahash" xmlns:w16sdtfl="http://schemas.microsoft.com/office/word/2024/wordml/sdtformatlock" xmlns:w16se="http://schemas.microsoft.com/office/word/2015/wordml/symex" xmlns:wpg="http://schemas.microsoft.com/office/word/2010/wordprocessingGroup" xmlns:wpi="http://schemas.microsoft.com/office/word/2010/wordprocessingInk" xmlns:wne="http://schemas.microsoft.com/office/word/2006/wordml" xmlns:wps="http://schemas.microsoft.com/office/word/2010/wordprocessingShape" mc:Ignorable="w14 w15 w16se w16cid w16 w16cex w16sdtdh w16sdtfl w16du wp14">
   <w:abstractNum w:abstractNumId="0" w15:restartNumberingAfterBreak="0">
+    <w:nsid w:val="025D6061"/>
+    <w:multiLevelType w:val="hybridMultilevel"/>
+    <w:tmpl w:val="BEAC4D10"/>
+    <w:lvl w:ilvl="0" w:tplc="08090011">
+      <w:start w:val="1"/>
+      <w:numFmt w:val="decimal"/>
+      <w:lvlText w:val="%1)"/>
+      <w:lvlJc w:val="left"/>
+      <w:pPr>
+        <w:ind w:left="720" w:hanging="360"/>
+      </w:pPr>
+      <w:rPr>
+        <w:rFonts w:hint="default"/>
+      </w:rPr>
+    </w:lvl>
+    <w:lvl w:ilvl="1" w:tplc="08090019" w:tentative="1">
+      <w:start w:val="1"/>
+      <w:numFmt w:val="lowerLetter"/>
+      <w:lvlText w:val="%2."/>
+      <w:lvlJc w:val="left"/>
+      <w:pPr>
+        <w:ind w:left="1440" w:hanging="360"/>
+      </w:pPr>
+    </w:lvl>
+    <w:lvl w:ilvl="2" w:tplc="0809001B" w:tentative="1">
+      <w:start w:val="1"/>
+      <w:numFmt w:val="lowerRoman"/>
+      <w:lvlText w:val="%3."/>
+      <w:lvlJc w:val="right"/>
+      <w:pPr>
+        <w:ind w:left="2160" w:hanging="180"/>
+      </w:pPr>
+    </w:lvl>
+    <w:lvl w:ilvl="3" w:tplc="0809000F" w:tentative="1">
+      <w:start w:val="1"/>
+      <w:numFmt w:val="decimal"/>
+      <w:lvlText w:val="%4."/>
+      <w:lvlJc w:val="left"/>
+      <w:pPr>
+        <w:ind w:left="2880" w:hanging="360"/>
+      </w:pPr>
+    </w:lvl>
+    <w:lvl w:ilvl="4" w:tplc="08090019" w:tentative="1">
+      <w:start w:val="1"/>
+      <w:numFmt w:val="lowerLetter"/>
+      <w:lvlText w:val="%5."/>
+      <w:lvlJc w:val="left"/>
+      <w:pPr>
+        <w:ind w:left="3600" w:hanging="360"/>
+      </w:pPr>
+    </w:lvl>
+    <w:lvl w:ilvl="5" w:tplc="0809001B" w:tentative="1">
+      <w:start w:val="1"/>
+      <w:numFmt w:val="lowerRoman"/>
+      <w:lvlText w:val="%6."/>
+      <w:lvlJc w:val="right"/>
+      <w:pPr>
+        <w:ind w:left="4320" w:hanging="180"/>
+      </w:pPr>
+    </w:lvl>
+    <w:lvl w:ilvl="6" w:tplc="0809000F" w:tentative="1">
+      <w:start w:val="1"/>
+      <w:numFmt w:val="decimal"/>
+      <w:lvlText w:val="%7."/>
+      <w:lvlJc w:val="left"/>
+      <w:pPr>
+        <w:ind w:left="5040" w:hanging="360"/>
+      </w:pPr>
+    </w:lvl>
+    <w:lvl w:ilvl="7" w:tplc="08090019" w:tentative="1">
+      <w:start w:val="1"/>
+      <w:numFmt w:val="lowerLetter"/>
+      <w:lvlText w:val="%8."/>
+      <w:lvlJc w:val="left"/>
+      <w:pPr>
+        <w:ind w:left="5760" w:hanging="360"/>
+      </w:pPr>
+    </w:lvl>
+    <w:lvl w:ilvl="8" w:tplc="0809001B" w:tentative="1">
+      <w:start w:val="1"/>
+      <w:numFmt w:val="lowerRoman"/>
+      <w:lvlText w:val="%9."/>
+      <w:lvlJc w:val="right"/>
+      <w:pPr>
+        <w:ind w:left="6480" w:hanging="180"/>
+      </w:pPr>
+    </w:lvl>
+  </w:abstractNum>
+  <w:abstractNum w:abstractNumId="1" w15:restartNumberingAfterBreak="0">
+    <w:nsid w:val="0C5F3FF0"/>
+    <w:multiLevelType w:val="hybridMultilevel"/>
+    <w:tmpl w:val="40D6B1EE"/>
+    <w:lvl w:ilvl="0" w:tplc="08090011">
+      <w:start w:val="1"/>
+      <w:numFmt w:val="decimal"/>
+      <w:lvlText w:val="%1)"/>
+      <w:lvlJc w:val="left"/>
+      <w:pPr>
+        <w:ind w:left="720" w:hanging="360"/>
+      </w:pPr>
+      <w:rPr>
+        <w:rFonts w:hint="default"/>
+      </w:rPr>
+    </w:lvl>
+    <w:lvl w:ilvl="1" w:tplc="08090019" w:tentative="1">
+      <w:start w:val="1"/>
+      <w:numFmt w:val="lowerLetter"/>
+      <w:lvlText w:val="%2."/>
+      <w:lvlJc w:val="left"/>
+      <w:pPr>
+        <w:ind w:left="1440" w:hanging="360"/>
+      </w:pPr>
+    </w:lvl>
+    <w:lvl w:ilvl="2" w:tplc="0809001B" w:tentative="1">
+      <w:start w:val="1"/>
+      <w:numFmt w:val="lowerRoman"/>
+      <w:lvlText w:val="%3."/>
+      <w:lvlJc w:val="right"/>
+      <w:pPr>
+        <w:ind w:left="2160" w:hanging="180"/>
+      </w:pPr>
+    </w:lvl>
+    <w:lvl w:ilvl="3" w:tplc="0809000F" w:tentative="1">
+      <w:start w:val="1"/>
+      <w:numFmt w:val="decimal"/>
+      <w:lvlText w:val="%4."/>
+      <w:lvlJc w:val="left"/>
+      <w:pPr>
+        <w:ind w:left="2880" w:hanging="360"/>
+      </w:pPr>
+    </w:lvl>
+    <w:lvl w:ilvl="4" w:tplc="08090019" w:tentative="1">
+      <w:start w:val="1"/>
+      <w:numFmt w:val="lowerLetter"/>
+      <w:lvlText w:val="%5."/>
+      <w:lvlJc w:val="left"/>
+      <w:pPr>
+        <w:ind w:left="3600" w:hanging="360"/>
+      </w:pPr>
+    </w:lvl>
+    <w:lvl w:ilvl="5" w:tplc="0809001B" w:tentative="1">
+      <w:start w:val="1"/>
+      <w:numFmt w:val="lowerRoman"/>
+      <w:lvlText w:val="%6."/>
+      <w:lvlJc w:val="right"/>
+      <w:pPr>
+        <w:ind w:left="4320" w:hanging="180"/>
+      </w:pPr>
+    </w:lvl>
+    <w:lvl w:ilvl="6" w:tplc="0809000F" w:tentative="1">
+      <w:start w:val="1"/>
+      <w:numFmt w:val="decimal"/>
+      <w:lvlText w:val="%7."/>
+      <w:lvlJc w:val="left"/>
+      <w:pPr>
+        <w:ind w:left="5040" w:hanging="360"/>
+      </w:pPr>
+    </w:lvl>
+    <w:lvl w:ilvl="7" w:tplc="08090019" w:tentative="1">
+      <w:start w:val="1"/>
+      <w:numFmt w:val="lowerLetter"/>
+      <w:lvlText w:val="%8."/>
+      <w:lvlJc w:val="left"/>
+      <w:pPr>
+        <w:ind w:left="5760" w:hanging="360"/>
+      </w:pPr>
+    </w:lvl>
+    <w:lvl w:ilvl="8" w:tplc="0809001B" w:tentative="1">
+      <w:start w:val="1"/>
+      <w:numFmt w:val="lowerRoman"/>
+      <w:lvlText w:val="%9."/>
+      <w:lvlJc w:val="right"/>
+      <w:pPr>
+        <w:ind w:left="6480" w:hanging="180"/>
+      </w:pPr>
+    </w:lvl>
+  </w:abstractNum>
+  <w:abstractNum w:abstractNumId="2" w15:restartNumberingAfterBreak="0">
     <w:nsid w:val="25C53EB1"/>
     <w:multiLevelType w:val="hybridMultilevel"/>
     <w:tmpl w:val="CC321E76"/>
@@ -229,7 +457,7 @@
       </w:pPr>
     </w:lvl>
   </w:abstractNum>
-  <w:abstractNum w:abstractNumId="1" w15:restartNumberingAfterBreak="0">
+  <w:abstractNum w:abstractNumId="3" w15:restartNumberingAfterBreak="0">
     <w:nsid w:val="362E46BD"/>
     <w:multiLevelType w:val="hybridMultilevel"/>
     <w:tmpl w:val="E4FAEC1A"/>
@@ -283,7 +511,7 @@
       <w:lvlJc w:val="left"/>
     </w:lvl>
   </w:abstractNum>
-  <w:abstractNum w:abstractNumId="2" w15:restartNumberingAfterBreak="0">
+  <w:abstractNum w:abstractNumId="4" w15:restartNumberingAfterBreak="0">
     <w:nsid w:val="377A7A3E"/>
     <w:multiLevelType w:val="hybridMultilevel"/>
     <w:tmpl w:val="E37813AE"/>
@@ -396,7 +624,7 @@
       </w:rPr>
     </w:lvl>
   </w:abstractNum>
-  <w:abstractNum w:abstractNumId="3" w15:restartNumberingAfterBreak="0">
+  <w:abstractNum w:abstractNumId="5" w15:restartNumberingAfterBreak="0">
     <w:nsid w:val="5D705DF0"/>
     <w:multiLevelType w:val="hybridMultilevel"/>
     <w:tmpl w:val="362A7BC0"/>
@@ -458,7 +686,7 @@
       <w:lvlJc w:val="left"/>
     </w:lvl>
   </w:abstractNum>
-  <w:abstractNum w:abstractNumId="4" w15:restartNumberingAfterBreak="0">
+  <w:abstractNum w:abstractNumId="6" w15:restartNumberingAfterBreak="0">
     <w:nsid w:val="5FB5656A"/>
     <w:multiLevelType w:val="hybridMultilevel"/>
     <w:tmpl w:val="DC486B94"/>
@@ -512,7 +740,7 @@
       <w:lvlJc w:val="left"/>
     </w:lvl>
   </w:abstractNum>
-  <w:abstractNum w:abstractNumId="5" w15:restartNumberingAfterBreak="0">
+  <w:abstractNum w:abstractNumId="7" w15:restartNumberingAfterBreak="0">
     <w:nsid w:val="70C6202F"/>
     <w:multiLevelType w:val="hybridMultilevel"/>
     <w:tmpl w:val="B762D162"/>
@@ -567,37 +795,43 @@
     </w:lvl>
   </w:abstractNum>
   <w:num w:numId="1" w16cid:durableId="1419601051">
-    <w:abstractNumId w:val="0"/>
+    <w:abstractNumId w:val="2"/>
     <w:lvlOverride w:ilvl="0">
       <w:startOverride w:val="1"/>
     </w:lvlOverride>
   </w:num>
   <w:num w:numId="2" w16cid:durableId="925579691">
-    <w:abstractNumId w:val="1"/>
+    <w:abstractNumId w:val="3"/>
     <w:lvlOverride w:ilvl="0">
       <w:startOverride w:val="1"/>
     </w:lvlOverride>
   </w:num>
   <w:num w:numId="3" w16cid:durableId="188299818">
-    <w:abstractNumId w:val="3"/>
+    <w:abstractNumId w:val="5"/>
     <w:lvlOverride w:ilvl="0">
       <w:startOverride w:val="1"/>
     </w:lvlOverride>
   </w:num>
   <w:num w:numId="4" w16cid:durableId="984160672">
-    <w:abstractNumId w:val="5"/>
+    <w:abstractNumId w:val="7"/>
     <w:lvlOverride w:ilvl="0">
       <w:startOverride w:val="1"/>
     </w:lvlOverride>
   </w:num>
   <w:num w:numId="5" w16cid:durableId="2013215055">
-    <w:abstractNumId w:val="4"/>
+    <w:abstractNumId w:val="6"/>
     <w:lvlOverride w:ilvl="0">
       <w:startOverride w:val="1"/>
     </w:lvlOverride>
   </w:num>
   <w:num w:numId="6" w16cid:durableId="2037658484">
-    <w:abstractNumId w:val="2"/>
+    <w:abstractNumId w:val="4"/>
+  </w:num>
+  <w:num w:numId="7" w16cid:durableId="1162618692">
+    <w:abstractNumId w:val="1"/>
+  </w:num>
+  <w:num w:numId="8" w16cid:durableId="256134231">
+    <w:abstractNumId w:val="0"/>
   </w:num>
 </w:numbering>
 </file>

</xml_diff>